<commit_message>
Add per-account OpenAI-compatible model settings and full regression checks
</commit_message>
<xml_diff>
--- a/docs/TeachAgent-功能与部署文档.docx
+++ b/docs/TeachAgent-功能与部署文档.docx
@@ -66,12 +66,12 @@
     </w:p>
     <w:p>
       <w:r>
-        <w:t>版本：1.0.0</w:t>
+        <w:t>版本：1.1.0</w:t>
       </w:r>
     </w:p>
     <w:p>
       <w:r>
-        <w:t>文档日期：2026-09-15</w:t>
+        <w:t>文档日期：2026-09-18</w:t>
       </w:r>
     </w:p>
     <w:p>
@@ -451,7 +451,7 @@
               <w:rPr>
                 <w:sz w:val="16"/>
               </w:rPr>
-              <w:t>本机 Ollama 结合课堂及历史对话；规则降级明确标注</w:t>
+              <w:t>本机 Ollama / 本地规则 / 按账号 OpenAI 兼容服务；来源明确标注</w:t>
             </w:r>
           </w:p>
         </w:tc>
@@ -1330,7 +1330,7 @@
     </w:p>
     <w:p>
       <w:r>
-        <w:t>抽帧、WAV 和原视频均保存在所属教师的本地目录内。即使抽帧已完成，ASR 模型缺失时也会将任务标记为失败，并显示安装模型提示。</w:t>
+        <w:t>短视频若常规 30 秒采样未产生帧，会补抽首帧。抽帧、WAV 和原视频均保存在所属教师的本地目录内。即使抽帧已完成，ASR 模型缺失时也会将任务标记为失败，并显示安装模型提示。</w:t>
       </w:r>
     </w:p>
     <w:p>
@@ -2334,7 +2334,7 @@
         <w:pStyle w:val="Heading1"/>
       </w:pPr>
       <w:r>
-        <w:t>5. 本地 Agent 与追问</w:t>
+        <w:t>5. Agent 与可配置模型追问</w:t>
       </w:r>
     </w:p>
     <w:p>
@@ -2354,7 +2354,506 @@
     </w:p>
     <w:p>
       <w:r>
-        <w:t>Ollama 请求超时为 90 秒，输出上限参数为 900 tokens，温度 0.3。不在线拉取模型。连接失败、模型不存在或返回异常时使用本地规则建议，界面清楚显示来源。规则模式依据问题中的互动、提问、语言等关键词选择相关建议，不承诺大模型自由对话能力。</w:t>
+        <w:t>请求默认超时为 60 秒，输出上限参数为 900 tokens，温度 0.3。不在线拉取模型。连接失败、模型不存在或返回异常时使用本地规则建议，界面清楚显示来源。规则模式依据问题中的互动、提问、语言等关键词选择相关建议，不承诺大模型自由对话能力。</w:t>
+      </w:r>
+    </w:p>
+    <w:p>
+      <w:pPr>
+        <w:pStyle w:val="Heading2"/>
+      </w:pPr>
+      <w:r>
+        <w:t>5.1 在线模型设置操作</w:t>
+      </w:r>
+    </w:p>
+    <w:p>
+      <w:pPr>
+        <w:pStyle w:val="ListNumber"/>
+      </w:pPr>
+      <w:r>
+        <w:t>在学校本地部署登录教师账号，进入“空间设置 → 模型服务设置”。</w:t>
+      </w:r>
+    </w:p>
+    <w:p>
+      <w:pPr>
+        <w:pStyle w:val="ListNumber"/>
+      </w:pPr>
+      <w:r>
+        <w:t>选择“OpenAI 兼容服务”。填写服务的 API 前缀，例如 https://api.openai.com/v1，不要填写网页聊天入口；系统会调用 /chat/completions。也接受以 /chat/completions 结尾的地址并自动规范化。</w:t>
+      </w:r>
+    </w:p>
+    <w:p>
+      <w:pPr>
+        <w:pStyle w:val="ListNumber"/>
+      </w:pPr>
+      <w:r>
+        <w:t>填写服务商实际支持的模型 ID 和 API Key。免鉴权的兼容服务可以不填密钥。禁止 URL 内嵌账号、查询参数、片段和无效端口。</w:t>
+      </w:r>
+    </w:p>
+    <w:p>
+      <w:pPr>
+        <w:pStyle w:val="ListNumber"/>
+      </w:pPr>
+      <w:r>
+        <w:t>阅读数据发送范围并勾选同意。点击“测试连接”发送一条固定测试语句，不包含课堂数据；可能产生少量模型费用。测试成功不等于已保存设置。</w:t>
+      </w:r>
+    </w:p>
+    <w:p>
+      <w:pPr>
+        <w:pStyle w:val="ListNumber"/>
+      </w:pPr>
+      <w:r>
+        <w:t>点击“保存模型设置”。下一次追问读取当前账号配置。配置后进入课堂的“AI 追问”查看目标服务和回答来源。</w:t>
+      </w:r>
+    </w:p>
+    <w:p>
+      <w:pPr>
+        <w:pStyle w:val="ListNumber"/>
+      </w:pPr>
+      <w:r>
+        <w:t>需要关闭在线请求时，选择“本地规则建议”或“本机 Ollama”并保存。切换模式不会自动删除已保存密钥，需要删除时在兼容服务面板勾选清除并保存。</w:t>
+      </w:r>
+    </w:p>
+    <w:tbl>
+      <w:tblPr>
+        <w:tblStyle w:val="LightShading-Accent1"/>
+        <w:tblW w:type="auto" w:w="0"/>
+        <w:tblLook w:firstColumn="1" w:firstRow="1" w:lastColumn="0" w:lastRow="0" w:noHBand="0" w:noVBand="1" w:val="04A0"/>
+      </w:tblPr>
+      <w:tblGrid>
+        <w:gridCol w:w="3099"/>
+        <w:gridCol w:w="3099"/>
+        <w:gridCol w:w="3099"/>
+      </w:tblGrid>
+      <w:tr>
+        <w:trPr>
+          <w:cantSplit/>
+          <w:tblHeader/>
+        </w:trPr>
+        <w:tc>
+          <w:tcPr>
+            <w:tcW w:type="dxa" w:w="3099"/>
+          </w:tcPr>
+          <w:p>
+            <w:r>
+              <w:rPr>
+                <w:sz w:val="16"/>
+              </w:rPr>
+              <w:t>设置项</w:t>
+            </w:r>
+          </w:p>
+        </w:tc>
+        <w:tc>
+          <w:tcPr>
+            <w:tcW w:type="dxa" w:w="3099"/>
+          </w:tcPr>
+          <w:p>
+            <w:r>
+              <w:rPr>
+                <w:sz w:val="16"/>
+              </w:rPr>
+              <w:t>默认值 / 范围</w:t>
+            </w:r>
+          </w:p>
+        </w:tc>
+        <w:tc>
+          <w:tcPr>
+            <w:tcW w:type="dxa" w:w="3099"/>
+          </w:tcPr>
+          <w:p>
+            <w:r>
+              <w:rPr>
+                <w:sz w:val="16"/>
+              </w:rPr>
+              <w:t>行为</w:t>
+            </w:r>
+          </w:p>
+        </w:tc>
+      </w:tr>
+      <w:tr>
+        <w:trPr>
+          <w:cantSplit/>
+        </w:trPr>
+        <w:tc>
+          <w:tcPr>
+            <w:tcW w:type="dxa" w:w="3099"/>
+          </w:tcPr>
+          <w:p>
+            <w:r>
+              <w:rPr>
+                <w:sz w:val="16"/>
+              </w:rPr>
+              <w:t>提供方式</w:t>
+            </w:r>
+          </w:p>
+        </w:tc>
+        <w:tc>
+          <w:tcPr>
+            <w:tcW w:type="dxa" w:w="3099"/>
+          </w:tcPr>
+          <w:p>
+            <w:r>
+              <w:rPr>
+                <w:sz w:val="16"/>
+              </w:rPr>
+              <w:t>本机 Ollama</w:t>
+            </w:r>
+          </w:p>
+        </w:tc>
+        <w:tc>
+          <w:tcPr>
+            <w:tcW w:type="dxa" w:w="3099"/>
+          </w:tcPr>
+          <w:p>
+            <w:r>
+              <w:rPr>
+                <w:sz w:val="16"/>
+              </w:rPr>
+              <w:t>local / rules / openai，账号互不影响</w:t>
+            </w:r>
+          </w:p>
+        </w:tc>
+      </w:tr>
+      <w:tr>
+        <w:trPr>
+          <w:cantSplit/>
+        </w:trPr>
+        <w:tc>
+          <w:tcPr>
+            <w:tcW w:type="dxa" w:w="3099"/>
+          </w:tcPr>
+          <w:p>
+            <w:r>
+              <w:rPr>
+                <w:sz w:val="16"/>
+              </w:rPr>
+              <w:t>Base URL</w:t>
+            </w:r>
+          </w:p>
+        </w:tc>
+        <w:tc>
+          <w:tcPr>
+            <w:tcW w:type="dxa" w:w="3099"/>
+          </w:tcPr>
+          <w:p>
+            <w:r>
+              <w:rPr>
+                <w:sz w:val="16"/>
+              </w:rPr>
+              <w:t>https://api.openai.com/v1</w:t>
+            </w:r>
+          </w:p>
+        </w:tc>
+        <w:tc>
+          <w:tcPr>
+            <w:tcW w:type="dxa" w:w="3099"/>
+          </w:tcPr>
+          <w:p>
+            <w:r>
+              <w:rPr>
+                <w:sz w:val="16"/>
+              </w:rPr>
+              <w:t>仅服务前缀；HTTPS，回环地址可 HTTP</w:t>
+            </w:r>
+          </w:p>
+        </w:tc>
+      </w:tr>
+      <w:tr>
+        <w:trPr>
+          <w:cantSplit/>
+        </w:trPr>
+        <w:tc>
+          <w:tcPr>
+            <w:tcW w:type="dxa" w:w="3099"/>
+          </w:tcPr>
+          <w:p>
+            <w:r>
+              <w:rPr>
+                <w:sz w:val="16"/>
+              </w:rPr>
+              <w:t>模型 ID</w:t>
+            </w:r>
+          </w:p>
+        </w:tc>
+        <w:tc>
+          <w:tcPr>
+            <w:tcW w:type="dxa" w:w="3099"/>
+          </w:tcPr>
+          <w:p>
+            <w:r>
+              <w:rPr>
+                <w:sz w:val="16"/>
+              </w:rPr>
+              <w:t>未配置</w:t>
+            </w:r>
+          </w:p>
+        </w:tc>
+        <w:tc>
+          <w:tcPr>
+            <w:tcW w:type="dxa" w:w="3099"/>
+          </w:tcPr>
+          <w:p>
+            <w:r>
+              <w:rPr>
+                <w:sz w:val="16"/>
+              </w:rPr>
+              <w:t>openai 模式必填，由服务商确定</w:t>
+            </w:r>
+          </w:p>
+        </w:tc>
+      </w:tr>
+      <w:tr>
+        <w:trPr>
+          <w:cantSplit/>
+        </w:trPr>
+        <w:tc>
+          <w:tcPr>
+            <w:tcW w:type="dxa" w:w="3099"/>
+          </w:tcPr>
+          <w:p>
+            <w:r>
+              <w:rPr>
+                <w:sz w:val="16"/>
+              </w:rPr>
+              <w:t>API Key</w:t>
+            </w:r>
+          </w:p>
+        </w:tc>
+        <w:tc>
+          <w:tcPr>
+            <w:tcW w:type="dxa" w:w="3099"/>
+          </w:tcPr>
+          <w:p>
+            <w:r>
+              <w:rPr>
+                <w:sz w:val="16"/>
+              </w:rPr>
+              <w:t>未配置</w:t>
+            </w:r>
+          </w:p>
+        </w:tc>
+        <w:tc>
+          <w:tcPr>
+            <w:tcW w:type="dxa" w:w="3099"/>
+          </w:tcPr>
+          <w:p>
+            <w:r>
+              <w:rPr>
+                <w:sz w:val="16"/>
+              </w:rPr>
+              <w:t>只写不读回；同地址留空保留，换地址清除旧密钥</w:t>
+            </w:r>
+          </w:p>
+        </w:tc>
+      </w:tr>
+      <w:tr>
+        <w:trPr>
+          <w:cantSplit/>
+        </w:trPr>
+        <w:tc>
+          <w:tcPr>
+            <w:tcW w:type="dxa" w:w="3099"/>
+          </w:tcPr>
+          <w:p>
+            <w:r>
+              <w:rPr>
+                <w:sz w:val="16"/>
+              </w:rPr>
+              <w:t>允许文本外发</w:t>
+            </w:r>
+          </w:p>
+        </w:tc>
+        <w:tc>
+          <w:tcPr>
+            <w:tcW w:type="dxa" w:w="3099"/>
+          </w:tcPr>
+          <w:p>
+            <w:r>
+              <w:rPr>
+                <w:sz w:val="16"/>
+              </w:rPr>
+              <w:t>否</w:t>
+            </w:r>
+          </w:p>
+        </w:tc>
+        <w:tc>
+          <w:tcPr>
+            <w:tcW w:type="dxa" w:w="3099"/>
+          </w:tcPr>
+          <w:p>
+            <w:r>
+              <w:rPr>
+                <w:sz w:val="16"/>
+              </w:rPr>
+              <w:t>openai 模式测试及保存前必须明确同意</w:t>
+            </w:r>
+          </w:p>
+        </w:tc>
+      </w:tr>
+      <w:tr>
+        <w:trPr>
+          <w:cantSplit/>
+        </w:trPr>
+        <w:tc>
+          <w:tcPr>
+            <w:tcW w:type="dxa" w:w="3099"/>
+          </w:tcPr>
+          <w:p>
+            <w:r>
+              <w:rPr>
+                <w:sz w:val="16"/>
+              </w:rPr>
+              <w:t>请求超时</w:t>
+            </w:r>
+          </w:p>
+        </w:tc>
+        <w:tc>
+          <w:tcPr>
+            <w:tcW w:type="dxa" w:w="3099"/>
+          </w:tcPr>
+          <w:p>
+            <w:r>
+              <w:rPr>
+                <w:sz w:val="16"/>
+              </w:rPr>
+              <w:t>60 秒；5–120</w:t>
+            </w:r>
+          </w:p>
+        </w:tc>
+        <w:tc>
+          <w:tcPr>
+            <w:tcW w:type="dxa" w:w="3099"/>
+          </w:tcPr>
+          <w:p>
+            <w:r>
+              <w:rPr>
+                <w:sz w:val="16"/>
+              </w:rPr>
+              <w:t>包含总请求时间限制</w:t>
+            </w:r>
+          </w:p>
+        </w:tc>
+      </w:tr>
+      <w:tr>
+        <w:trPr>
+          <w:cantSplit/>
+        </w:trPr>
+        <w:tc>
+          <w:tcPr>
+            <w:tcW w:type="dxa" w:w="3099"/>
+          </w:tcPr>
+          <w:p>
+            <w:r>
+              <w:rPr>
+                <w:sz w:val="16"/>
+              </w:rPr>
+              <w:t>温度</w:t>
+            </w:r>
+          </w:p>
+        </w:tc>
+        <w:tc>
+          <w:tcPr>
+            <w:tcW w:type="dxa" w:w="3099"/>
+          </w:tcPr>
+          <w:p>
+            <w:r>
+              <w:rPr>
+                <w:sz w:val="16"/>
+              </w:rPr>
+              <w:t>0.3；0–2</w:t>
+            </w:r>
+          </w:p>
+        </w:tc>
+        <w:tc>
+          <w:tcPr>
+            <w:tcW w:type="dxa" w:w="3099"/>
+          </w:tcPr>
+          <w:p>
+            <w:r>
+              <w:rPr>
+                <w:sz w:val="16"/>
+              </w:rPr>
+              <w:t>服务需支持 temperature 参数</w:t>
+            </w:r>
+          </w:p>
+        </w:tc>
+      </w:tr>
+      <w:tr>
+        <w:trPr>
+          <w:cantSplit/>
+        </w:trPr>
+        <w:tc>
+          <w:tcPr>
+            <w:tcW w:type="dxa" w:w="3099"/>
+          </w:tcPr>
+          <w:p>
+            <w:r>
+              <w:rPr>
+                <w:sz w:val="16"/>
+              </w:rPr>
+              <w:t>输出上限</w:t>
+            </w:r>
+          </w:p>
+        </w:tc>
+        <w:tc>
+          <w:tcPr>
+            <w:tcW w:type="dxa" w:w="3099"/>
+          </w:tcPr>
+          <w:p>
+            <w:r>
+              <w:rPr>
+                <w:sz w:val="16"/>
+              </w:rPr>
+              <w:t>900；128–4096</w:t>
+            </w:r>
+          </w:p>
+        </w:tc>
+        <w:tc>
+          <w:tcPr>
+            <w:tcW w:type="dxa" w:w="3099"/>
+          </w:tcPr>
+          <w:p>
+            <w:r>
+              <w:rPr>
+                <w:sz w:val="16"/>
+              </w:rPr>
+              <w:t>使用 max_tokens 参数</w:t>
+            </w:r>
+          </w:p>
+        </w:tc>
+      </w:tr>
+    </w:tbl>
+    <w:p/>
+    <w:p>
+      <w:r>
+        <w:t>兼容范围为 HTTP Chat Completions、Bearer 鉴权（可选）、非流式纯文本 choices[0].message.content。本版本不支持 Responses API、流式 SSE、工具调用、图像输入或某些推理模型的专用参数。个别服务不接受 temperature/max_tokens 时，连接测试会报错，应选择支持该协议的模型或网关。</w:t>
+      </w:r>
+    </w:p>
+    <w:p>
+      <w:pPr>
+        <w:pStyle w:val="Heading2"/>
+      </w:pPr>
+      <w:r>
+        <w:t>5.2 数据流向、错误与凭据管理</w:t>
+      </w:r>
+    </w:p>
+    <w:p>
+      <w:r>
+        <w:t>默认本地处理保持不变。在线仅作用于教研追问：发送当前课堂摘要、指标、优化建议、方法边界、前 100 个转写片段、最近 8 条历史消息与当前问题。视频、音频、抽帧、其他教师数据及基础报告计算不外发。长课超过 100 段的原文不会全部提供给模型；历史中已有的课堂引用也可能随历史消息发出。学校应按自己的数据制度决定是否启用。</w:t>
+      </w:r>
+    </w:p>
+    <w:p>
+      <w:r>
+        <w:t>在线失败明确返回错误：401/403 显示认证失败，404 显示地址或模型不存在，429 显示限流或额度不足；超时返回 504，其余服务故障返回 502。重定向不会自动跟随，响应超过 1 MB、空文本或不兼容 JSON 均拒绝。失败不会保存成成功问答，也不静默切换规则。Ollama 不可用时保留原有规则降级行为；手动规则模式不发模型请求。</w:t>
+      </w:r>
+    </w:p>
+    <w:p>
+      <w:r>
+        <w:t>凭据由 Fernet 加密后存入本地 SQLite；主密钥保存于数据目录 model-settings.key。接口仅返回 api_key_configured，不返回原文或密文。密钥不存入浏览器 localStorage，不进入审计日志、课堂报告或按账号 ZIP。更改服务地址时不沿用旧密钥，避免把原服务凭据发给新目标。模型设置验证错误不回显原始请求内容。</w:t>
+      </w:r>
+    </w:p>
+    <w:p>
+      <w:r>
+        <w:t>文件加密不能抵御拥有服务器和解密密钥访问权限的管理员。部署时限制数据目录的操作系统权限；完整灾备必须保护并包含主密钥。缺失主密钥时服务拒绝使用旧凭据，允许清除后重新配置。公开 Pages 只能预览配置，完全不收集 API Key，也不会连接服务。</w:t>
       </w:r>
     </w:p>
     <w:p>
@@ -2371,7 +2870,7 @@
         <w:br/>
         <w:t>任务队列 → FFmpeg / PyAV → Whisper → 文本蒸馏与报告</w:t>
         <w:br/>
-        <w:t>本地教研追问 → 可选的本机 Ollama</w:t>
+        <w:t>教研追问 → 本机 Ollama / 本地规则 / 显式启用的 OpenAI 兼容服务（仅文本）</w:t>
       </w:r>
     </w:p>
     <w:p>
@@ -2511,7 +3010,7 @@
         <w:pStyle w:val="ListBullet"/>
       </w:pPr>
       <w:r>
-        <w:t>Ollama 只允许回环 IP HTTP，关闭环境代理和重定向。</w:t>
+        <w:t>Ollama 只允许回环 IP HTTP。兼容服务允许 HTTPS，HTTP 仅限本机回环地址；二者均关闭环境代理和重定向。API Key 加密保存、接口不回显，模型错误不透传服务商响应正文。</w:t>
       </w:r>
     </w:p>
     <w:p>
@@ -2832,7 +3331,7 @@
     </w:p>
     <w:p>
       <w:r>
-        <w:t>默认 Docker 网络下不能通过容器的 127.0.0.1 访问宿主 Ollama。Linux 如需共享宿主本机 Ollama，可将服务改用 network_mode: host，移除 ports，并将启动命令改成只监听 127.0.0.1:8000，从同机 Nginx 转发。不要将 URL 改为外部模型地址来绕过限制。Windows 建议原生部署应用与 Ollama，或使用规则建议模式。</w:t>
+        <w:t>默认 Docker 网络下不能通过容器的 127.0.0.1 访问宿主 Ollama。Linux 如需共享宿主本机 Ollama，可将服务改用 network_mode: host，移除 ports，并将启动命令改成只监听 127.0.0.1:8000，从同机 Nginx 转发。OLLAMA_URL 仍只接受本机回环 IP；需要在线服务时使用“模型服务设置”的 OpenAI 兼容方式。Windows 建议原生部署应用与 Ollama，或使用规则建议模式。</w:t>
       </w:r>
     </w:p>
     <w:p>
@@ -2850,7 +3349,7 @@
     </w:p>
     <w:p>
       <w:r>
-        <w:t>依赖安装、模型预下载、GitHub 源码发布属于开发或部署准备阶段，不发送课堂材料。正式运行时关闭学校服务器外网出口；浏览器仅连接本地源，模型与资料不需要外网。不要在运行时开放模型自动下载。更新软件时采用离线包审查与搬运流程。</w:t>
+        <w:t>依赖安装、模型预下载、GitHub 源码发布属于开发或部署准备阶段，不发送课堂材料。如采用纯本地模式，正式运行时关闭学校服务器外网出口，模型与资料不需要外网。若学校选择兼容在线模型，应只允许后端访问批准的服务地址，追问会发送明确列出的文本上下文；浏览器仍只连接本地应用源。不要在运行时开放模型自动下载。更新软件时采用离线包审查与搬运流程。</w:t>
       </w:r>
     </w:p>
     <w:p>
@@ -3450,6 +3949,11 @@
       </w:r>
     </w:p>
     <w:p>
+      <w:r>
+        <w:t>按账号 ZIP 故意不包含模型服务设置、加密后的 API Key 或解密密钥，避免归档教研资料时扩大凭据暴露范围。</w:t>
+      </w:r>
+    </w:p>
+    <w:p>
       <w:pPr>
         <w:pStyle w:val="Heading2"/>
       </w:pPr>
@@ -3475,7 +3979,7 @@
         <w:pStyle w:val="ListNumber"/>
       </w:pPr>
       <w:r>
-        <w:t>备份完整 TEACHAGENT_DATA，包括 SQLite、可能存在的 -wal / -shm 与 users/。</w:t>
+        <w:t>备份完整 TEACHAGENT_DATA，包括 SQLite、可能存在的 -wal / -shm、users/ 与 model-settings.key。缺失或更换解密密钥将无法解密已保存的 API Key；需恢复原文件，或在界面清除旧密钥后重新填写。</w:t>
       </w:r>
     </w:p>
     <w:p>
@@ -4459,6 +4963,138 @@
               <w:rPr>
                 <w:sz w:val="16"/>
               </w:rPr>
+              <w:t>/model-settings</w:t>
+            </w:r>
+          </w:p>
+        </w:tc>
+        <w:tc>
+          <w:tcPr>
+            <w:tcW w:type="dxa" w:w="3099"/>
+          </w:tcPr>
+          <w:p>
+            <w:r>
+              <w:rPr>
+                <w:sz w:val="16"/>
+              </w:rPr>
+              <w:t>当前账号配置与密钥已配置标志，不返回密钥</w:t>
+            </w:r>
+          </w:p>
+        </w:tc>
+      </w:tr>
+      <w:tr>
+        <w:trPr>
+          <w:cantSplit/>
+        </w:trPr>
+        <w:tc>
+          <w:tcPr>
+            <w:tcW w:type="dxa" w:w="3099"/>
+          </w:tcPr>
+          <w:p>
+            <w:r>
+              <w:rPr>
+                <w:sz w:val="16"/>
+              </w:rPr>
+              <w:t>PUT</w:t>
+            </w:r>
+          </w:p>
+        </w:tc>
+        <w:tc>
+          <w:tcPr>
+            <w:tcW w:type="dxa" w:w="3099"/>
+          </w:tcPr>
+          <w:p>
+            <w:r>
+              <w:rPr>
+                <w:sz w:val="16"/>
+              </w:rPr>
+              <w:t>/model-settings</w:t>
+            </w:r>
+          </w:p>
+        </w:tc>
+        <w:tc>
+          <w:tcPr>
+            <w:tcW w:type="dxa" w:w="3099"/>
+          </w:tcPr>
+          <w:p>
+            <w:r>
+              <w:rPr>
+                <w:sz w:val="16"/>
+              </w:rPr>
+              <w:t>保存当前账号的模型服务设置</w:t>
+            </w:r>
+          </w:p>
+        </w:tc>
+      </w:tr>
+      <w:tr>
+        <w:trPr>
+          <w:cantSplit/>
+        </w:trPr>
+        <w:tc>
+          <w:tcPr>
+            <w:tcW w:type="dxa" w:w="3099"/>
+          </w:tcPr>
+          <w:p>
+            <w:r>
+              <w:rPr>
+                <w:sz w:val="16"/>
+              </w:rPr>
+              <w:t>POST</w:t>
+            </w:r>
+          </w:p>
+        </w:tc>
+        <w:tc>
+          <w:tcPr>
+            <w:tcW w:type="dxa" w:w="3099"/>
+          </w:tcPr>
+          <w:p>
+            <w:r>
+              <w:rPr>
+                <w:sz w:val="16"/>
+              </w:rPr>
+              <w:t>/model-settings/test</w:t>
+            </w:r>
+          </w:p>
+        </w:tc>
+        <w:tc>
+          <w:tcPr>
+            <w:tcW w:type="dxa" w:w="3099"/>
+          </w:tcPr>
+          <w:p>
+            <w:r>
+              <w:rPr>
+                <w:sz w:val="16"/>
+              </w:rPr>
+              <w:t>使用当前表单进行连接测试，不保存配置</w:t>
+            </w:r>
+          </w:p>
+        </w:tc>
+      </w:tr>
+      <w:tr>
+        <w:trPr>
+          <w:cantSplit/>
+        </w:trPr>
+        <w:tc>
+          <w:tcPr>
+            <w:tcW w:type="dxa" w:w="3099"/>
+          </w:tcPr>
+          <w:p>
+            <w:r>
+              <w:rPr>
+                <w:sz w:val="16"/>
+              </w:rPr>
+              <w:t>GET</w:t>
+            </w:r>
+          </w:p>
+        </w:tc>
+        <w:tc>
+          <w:tcPr>
+            <w:tcW w:type="dxa" w:w="3099"/>
+          </w:tcPr>
+          <w:p>
+            <w:r>
+              <w:rPr>
+                <w:sz w:val="16"/>
+              </w:rPr>
               <w:t>/admin/audit</w:t>
             </w:r>
           </w:p>
@@ -4647,6 +5283,11 @@
         <w:t>扩展仍遵循“学校控制模型与服务器、课堂资料不出内网、教师数据按权限隔离”的边界。</w:t>
       </w:r>
     </w:p>
+    <w:p>
+      <w:r>
+        <w:t>本版本完整回归结果见 [2026-09-18 系统检验报告](系统检验报告-2026-09-18.md)。真实在线供应商尚未用学校凭据验收；本次兼容服务测试使用本机 HTTP 协议模拟服务。</w:t>
+      </w:r>
+    </w:p>
     <w:sectPr>
       <w:headerReference w:type="default" r:id="rId9"/>
       <w:footerReference w:type="default" r:id="rId10"/>
@@ -4666,7 +5307,7 @@
       <w:pStyle w:val="Footer"/>
     </w:pPr>
     <w:r>
-      <w:t xml:space="preserve">TeachAgent 1.0.0    ·    功能与部署文档                                      </w:t>
+      <w:t xml:space="preserve">TeachAgent 1.1.0    ·    功能与部署文档                                      </w:t>
     </w:r>
     <w:fldSimple w:instr="PAGE"/>
   </w:p>

</xml_diff>

<commit_message>
Allow HTTP endpoints for OpenAI-compatible model services
</commit_message>
<xml_diff>
--- a/docs/TeachAgent-功能与部署文档.docx
+++ b/docs/TeachAgent-功能与部署文档.docx
@@ -2552,7 +2552,7 @@
               <w:rPr>
                 <w:sz w:val="16"/>
               </w:rPr>
-              <w:t>仅服务前缀；HTTPS，回环地址可 HTTP</w:t>
+              <w:t>仅服务前缀；支持 HTTP / HTTPS、域名或 IP</w:t>
             </w:r>
           </w:p>
         </w:tc>
@@ -3010,7 +3010,7 @@
         <w:pStyle w:val="ListBullet"/>
       </w:pPr>
       <w:r>
-        <w:t>Ollama 只允许回环 IP HTTP。兼容服务允许 HTTPS，HTTP 仅限本机回环地址；二者均关闭环境代理和重定向。API Key 加密保存、接口不回显，模型错误不透传服务商响应正文。</w:t>
+        <w:t>Ollama 只允许回环 IP HTTP。兼容服务允许 HTTP / HTTPS，可使用域名、内网 IP 或回环地址；二者均关闭环境代理和重定向。API Key 加密保存、接口不回显，模型错误不透传服务商响应正文。</w:t>
       </w:r>
     </w:p>
     <w:p>

</xml_diff>

<commit_message>
Render assistant Markdown with progressive typewriter replies
</commit_message>
<xml_diff>
--- a/docs/TeachAgent-功能与部署文档.docx
+++ b/docs/TeachAgent-功能与部署文档.docx
@@ -2858,6 +2858,44 @@
     </w:p>
     <w:p>
       <w:pPr>
+        <w:pStyle w:val="Heading2"/>
+      </w:pPr>
+      <w:r>
+        <w:t>5.3 回答显示与 Markdown 排版</w:t>
+      </w:r>
+    </w:p>
+    <w:p>
+      <w:r>
+        <w:t>教研助手收到完整模型回答后，在浏览器中以打字机效果逐字展开；这属于前端阅读效果，模型接口仍使用非流式 Chat Completions。正常按约 24 毫秒一个字符组推进，较长回答加快显示，最长约 12 秒完成。中文、组合字符与 emoji 按完整字符组显示。点击“立即显示全文”可跳过动画，系统开启“减少动态效果”时直接显示全文。</w:t>
+      </w:r>
+    </w:p>
+    <w:p>
+      <w:r>
+        <w:t>仅新回答播放动画，历史记录直接展示全文。显示期间可提前输入下一条问题，当前回答显示完成后发送；切换课堂或离开对话时清理动画和浏览器待处理请求。完整原始回答仍由后端保存，动画不会修改报告、历史文本或模型上下文。</w:t>
+      </w:r>
+    </w:p>
+    <w:p>
+      <w:r>
+        <w:t>助手回复支持标准 Markdown 与 GFM：标题、粗体、斜体、有序/无序及嵌套列表、引用、行内代码、代码块、表格、任务清单、删除线和链接。用户输入保持纯文本。代码块与宽表格在自身区域滚动，手机页面不被撑宽。解析不执行原始 HTML 或脚本，不自动加载模型输出中的远程图片；图片显示说明文字，外部链接需用户主动点击。</w:t>
+      </w:r>
+    </w:p>
+    <w:p>
+      <w:r>
+        <w:t>对话位于底部时跟随新内容；向上翻阅后停止自动跟随，返回底部后继续。以下为合成回答的实际界面：</w:t>
+      </w:r>
+    </w:p>
+    <w:p>
+      <w:r>
+        <w:t>![教研助手 Markdown 回答](images/chat-markdown.png)</w:t>
+      </w:r>
+    </w:p>
+    <w:p>
+      <w:r>
+        <w:t>本轮验证：本地版 15 条、Pages 版 10 条浏览器测试通过；新增检查覆盖逐字推进、自然完成、立即展开、历史不重播、Unicode 完整输出、滚动跟随、减少动态效果、离开页面清理，以及 Markdown 元素、安全处理和 320px 窄屏。兼容服务端到端流程也验证模型返回 Markdown 标题和粗体的实际显示。新增依赖 npm 审计未发现已知漏洞。</w:t>
+      </w:r>
+    </w:p>
+    <w:p>
+      <w:pPr>
         <w:pStyle w:val="Heading1"/>
       </w:pPr>
       <w:r>

</xml_diff>

<commit_message>
Stream model replies with cancellation and persistent retry
</commit_message>
<xml_diff>
--- a/docs/TeachAgent-功能与部署文档.docx
+++ b/docs/TeachAgent-功能与部署文档.docx
@@ -451,7 +451,7 @@
               <w:rPr>
                 <w:sz w:val="16"/>
               </w:rPr>
-              <w:t>本机 Ollama / 本地规则 / 按账号 OpenAI 兼容服务；来源明确标注</w:t>
+              <w:t>本机 Ollama / 本地规则 / 按账号 OpenAI 兼容服务；真正流式输出、停止、重试，来源明确标注</w:t>
             </w:r>
           </w:p>
         </w:tc>
@@ -2825,7 +2825,7 @@
     <w:p/>
     <w:p>
       <w:r>
-        <w:t>兼容范围为 HTTP Chat Completions、Bearer 鉴权（可选）、非流式纯文本 choices[0].message.content。本版本不支持 Responses API、流式 SSE、工具调用、图像输入或某些推理模型的专用参数。个别服务不接受 temperature/max_tokens 时，连接测试会报错，应选择支持该协议的模型或网关。</w:t>
+        <w:t>兼容范围为 HTTP Chat Completions、Bearer 鉴权（可选）、stream=true SSE 文本增量 choices[].delta.content；结束标记为 finish_reason 或 [DONE]。本机 Ollama 使用 /api/chat 的 NDJSON 流及 done 标记。连接测试同样使用流式协议，验证草稿配置但不保存、不发送课堂数据。旧版非流式 POST 对话 API 保留兼容。本版本不支持 Responses API、工具调用、图像输入或某些推理模型的专用参数；服务需支持 temperature/max_tokens。</w:t>
       </w:r>
     </w:p>
     <w:p>
@@ -2843,7 +2843,7 @@
     </w:p>
     <w:p>
       <w:r>
-        <w:t>在线失败明确返回错误：401/403 显示认证失败，404 显示地址或模型不存在，429 显示限流或额度不足；超时返回 504，其余服务故障返回 502。重定向不会自动跟随，响应超过 1 MB、空文本或不兼容 JSON 均拒绝。失败不会保存成成功问答，也不静默切换规则。Ollama 不可用时保留原有规则降级行为；手动规则模式不发模型请求。</w:t>
+        <w:t>在线失败明确显示原因：401/403 显示认证失败，404 显示地址或模型不存在，429 显示限流或额度不足。流已建立后的错误通过终止事件返回，不能再更改 HTTP 200 状态；前端将其显示为失败并保留部分回答。连接测试超时返回 504，其余服务故障通常返回 502。重定向不自动跟随；流响应超过 1 MB、空文本、非法 JSON、缺失结束标记、长度截断或工具调用均报告失败，不静默切换规则。Ollama 仅在尚未输出文字时允许退回规则；中途失败保留原回答并标为失败，避免混合两种回答。手动规则模式不发模型请求。</w:t>
       </w:r>
     </w:p>
     <w:p>
@@ -2861,17 +2861,52 @@
         <w:pStyle w:val="Heading2"/>
       </w:pPr>
       <w:r>
-        <w:t>5.3 回答显示与 Markdown 排版</w:t>
+        <w:t>5.3 真正流式输出、停止与重试</w:t>
       </w:r>
     </w:p>
     <w:p>
       <w:r>
-        <w:t>教研助手收到完整模型回答后，在浏览器中以打字机效果逐字展开；这属于前端阅读效果，模型接口仍使用非流式 Chat Completions。正常按约 24 毫秒一个字符组推进，较长回答加快显示，最长约 12 秒完成。中文、组合字符与 emoji 按完整字符组显示。点击“立即显示全文”可跳过动画，系统开启“减少动态效果”时直接显示全文。</w:t>
+        <w:t>模型每返回一段文字，服务端即转发给浏览器并渲染 Markdown，不等待完整回答、不再叠加逐字播放动画。生成前显示“正在等待模型回应”，生成中显示“正在生成回答”。规则模式一次返回完整规则建议；公开 Pages 使用合成文字模拟分段输出，并明确标注不调用模型。</w:t>
       </w:r>
     </w:p>
     <w:p>
+      <w:pPr>
+        <w:pStyle w:val="ListBullet"/>
+      </w:pPr>
       <w:r>
-        <w:t>仅新回答播放动画，历史记录直接展示全文。显示期间可提前输入下一条问题，当前回答显示完成后发送；切换课堂或离开对话时清理动画和浏览器待处理请求。完整原始回答仍由后端保存，动画不会修改报告、历史文本或模型上下文。</w:t>
+        <w:t>停止生成：首字出现前或输出中均可停止；后端关闭与供应商的 HTTP 流，取消读取任务，保留已收到的文字，状态标记“已停止”。供应商是否终止内部计算或计费取决于其断连处理，系统不承诺供应商侧行为。正常停止等待后端确认；确认失联时浏览器会中断请求。</w:t>
+      </w:r>
+    </w:p>
+    <w:p>
+      <w:pPr>
+        <w:pStyle w:val="ListBullet"/>
+      </w:pPr>
+      <w:r>
+        <w:t>重试 / 重新生成：最近一轮失败、中断或已停止的回答显示“重试”；完成的回答显示“重新生成”。复用原问题和轮次 ID，替换原回答，尝试次数递增，不增加重复问题。重试使用当前保存的模型设置，旧回答被替换而不另存版本。旧版 API 的历史回答只读展示。</w:t>
+      </w:r>
+    </w:p>
+    <w:p>
+      <w:pPr>
+        <w:pStyle w:val="ListBullet"/>
+      </w:pPr>
+      <w:r>
+        <w:t>持久化与恢复：轮次保存在本地 chat_turns；状态为 running / stopping / completed / stopped / error / interrupted。生成中按至少 250ms 的间隔检查是否需要保存最新片段，正常结束或中断立即保存；强制断电仅保证已写入的片段。服务启动将未完成轮次标为中断，允许重试。按账号 ZIP 备份包含轮次与状态（manifest schema 2）；生成中拒绝备份。</w:t>
+      </w:r>
+    </w:p>
+    <w:p>
+      <w:pPr>
+        <w:pStyle w:val="ListBullet"/>
+      </w:pPr>
+      <w:r>
+        <w:t>历史与并发：模型仅使用最近 8 条已完成的历史消息，失败或停止的问答不进入上下文。每课堂最多一个活动生成任务；并发发送、重复请求、过期重试都会被拒绝。停止和重试均执行登录、CSRF、课堂归属检查。</w:t>
+      </w:r>
+    </w:p>
+    <w:p>
+      <w:pPr>
+        <w:pStyle w:val="ListBullet"/>
+      </w:pPr>
+      <w:r>
+        <w:t>页面行为：生成时禁止重复发送；离开聊天、切换课堂或关闭连接会取消上游请求。重新进入直接显示已保存历史；若另一个窗口仍在生成，可查看持久化进度并停止该请求。向上阅读不被新内容强制拉到底部。尊重减少动态效果设置，光标不闪烁；收到的内容仍实时显示。</w:t>
       </w:r>
     </w:p>
     <w:p>
@@ -2891,7 +2926,7 @@
     </w:p>
     <w:p>
       <w:r>
-        <w:t>本轮验证：本地版 15 条、Pages 版 10 条浏览器测试通过；新增检查覆盖逐字推进、自然完成、立即展开、历史不重播、Unicode 完整输出、滚动跟随、减少动态效果、离开页面清理，以及 Markdown 元素、安全处理和 320px 窄屏。兼容服务端到端流程也验证模型返回 Markdown 标题和粗体的实际显示。新增依赖 npm 审计未发现已知漏洞。</w:t>
+        <w:t>流式实现计划、协议、验收范围与结果见 [流式对话验收](流式对话验收.md)。实际外部供应商凭据未提供，协议与断连使用真实本机 HTTP 服务检验。</w:t>
       </w:r>
     </w:p>
     <w:p>
@@ -3370,6 +3405,11 @@
     <w:p>
       <w:r>
         <w:t>默认 Docker 网络下不能通过容器的 127.0.0.1 访问宿主 Ollama。Linux 如需共享宿主本机 Ollama，可将服务改用 network_mode: host，移除 ports，并将启动命令改成只监听 127.0.0.1:8000，从同机 Nginx 转发。OLLAMA_URL 仍只接受本机回环 IP；需要在线服务时使用“模型服务设置”的 OpenAI 兼容方式。Windows 建议原生部署应用与 Ollama，或使用规则建议模式。</w:t>
+      </w:r>
+    </w:p>
+    <w:p>
+      <w:r>
+        <w:t>流式服务按当前单进程 Uvicorn 部署运行。启动恢复逻辑会回收未完成轮次，不能直接改为多个 worker 或多个应用副本；需要多进程时应先实现跨进程任务租约和恢复协调。反向代理需关闭响应缓冲、缓存和压缩；仓库 deploy/nginx.conf 已设置 proxy_buffering off、proxy_cache off、gzip off，接口另返回 X-Accel-Buffering: no，等待首字时每 10 秒发送保活注释。</w:t>
       </w:r>
     </w:p>
     <w:p>
@@ -4882,7 +4922,95 @@
               <w:rPr>
                 <w:sz w:val="16"/>
               </w:rPr>
-              <w:t>获取对话 / 提交追问</w:t>
+              <w:t>获取含流式状态的历史 / 旧版非流式追问</w:t>
+            </w:r>
+          </w:p>
+        </w:tc>
+      </w:tr>
+      <w:tr>
+        <w:trPr>
+          <w:cantSplit/>
+        </w:trPr>
+        <w:tc>
+          <w:tcPr>
+            <w:tcW w:type="dxa" w:w="3099"/>
+          </w:tcPr>
+          <w:p>
+            <w:r>
+              <w:rPr>
+                <w:sz w:val="16"/>
+              </w:rPr>
+              <w:t>POST</w:t>
+            </w:r>
+          </w:p>
+        </w:tc>
+        <w:tc>
+          <w:tcPr>
+            <w:tcW w:type="dxa" w:w="3099"/>
+          </w:tcPr>
+          <w:p>
+            <w:r>
+              <w:rPr>
+                <w:sz w:val="16"/>
+              </w:rPr>
+              <w:t>/lessons/{id}/chat/stream</w:t>
+            </w:r>
+          </w:p>
+        </w:tc>
+        <w:tc>
+          <w:tcPr>
+            <w:tcW w:type="dxa" w:w="3099"/>
+          </w:tcPr>
+          <w:p>
+            <w:r>
+              <w:rPr>
+                <w:sz w:val="16"/>
+              </w:rPr>
+              <w:t>发起 SSE 对话或重试最近一轮</w:t>
+            </w:r>
+          </w:p>
+        </w:tc>
+      </w:tr>
+      <w:tr>
+        <w:trPr>
+          <w:cantSplit/>
+        </w:trPr>
+        <w:tc>
+          <w:tcPr>
+            <w:tcW w:type="dxa" w:w="3099"/>
+          </w:tcPr>
+          <w:p>
+            <w:r>
+              <w:rPr>
+                <w:sz w:val="16"/>
+              </w:rPr>
+              <w:t>POST</w:t>
+            </w:r>
+          </w:p>
+        </w:tc>
+        <w:tc>
+          <w:tcPr>
+            <w:tcW w:type="dxa" w:w="3099"/>
+          </w:tcPr>
+          <w:p>
+            <w:r>
+              <w:rPr>
+                <w:sz w:val="16"/>
+              </w:rPr>
+              <w:t>/lessons/{id}/chat/{request_id}/stop</w:t>
+            </w:r>
+          </w:p>
+        </w:tc>
+        <w:tc>
+          <w:tcPr>
+            <w:tcW w:type="dxa" w:w="3099"/>
+          </w:tcPr>
+          <w:p>
+            <w:r>
+              <w:rPr>
+                <w:sz w:val="16"/>
+              </w:rPr>
+              <w:t>停止当前轮次，保留收到内容</w:t>
             </w:r>
           </w:p>
         </w:tc>

</xml_diff>

<commit_message>
feat: add opt-in iFlytek speech transcription and illustrated manual
</commit_message>
<xml_diff>
--- a/docs/TeachAgent-功能与部署文档.docx
+++ b/docs/TeachAgent-功能与部署文档.docx
@@ -66,12 +66,12 @@
     </w:p>
     <w:p>
       <w:r>
-        <w:t>版本：1.1.0</w:t>
+        <w:t>版本：1.3.0</w:t>
       </w:r>
     </w:p>
     <w:p>
       <w:r>
-        <w:t>文档日期：2026-09-18</w:t>
+        <w:t>文档日期：2026-09-28</w:t>
       </w:r>
     </w:p>
     <w:p>
@@ -89,7 +89,7 @@
     </w:p>
     <w:p>
       <w:r>
-        <w:t>TeachAgent 是学校私有部署的课堂分析 WebUI Agent 系统。教师上传课堂视频，系统在本地抽帧、转写、清洗和结构化话语，生成授课方式画像与可优化点清单。教师可围绕课堂证据连续追问，并下载报告。管理员负责账号与按账号数据备份。</w:t>
+        <w:t>TeachAgent 是学校私有部署的课堂分析 WebUI Agent 系统。教师上传课堂视频，系统默认在本地抽帧、转写、清洗和结构化话语；1.3.0 可在上传时另行授权讯飞云端转写，生成授课方式画像与可优化点清单。教师可围绕课堂证据连续追问，并下载报告。管理员负责账号与按账号数据备份。</w:t>
       </w:r>
     </w:p>
     <w:p>
@@ -539,7 +539,7 @@
               <w:rPr>
                 <w:sz w:val="16"/>
               </w:rPr>
-              <w:t>Markdown、JSON、HTML；HTML 可由浏览器打印 PDF</w:t>
+              <w:t>Word（默认）、JSON、HTML；Markdown API 保留兼容；HTML 可由浏览器打印 PDF</w:t>
             </w:r>
           </w:p>
         </w:tc>
@@ -1222,7 +1222,7 @@
         <w:pStyle w:val="ListNumber"/>
       </w:pPr>
       <w:r>
-        <w:t>信息中心在服务器创建首个管理员。系统没有预置通用管理员密码。</w:t>
+        <w:t>信息中心在服务器创建用户名为 admin 的超级管理员。系统没有预置通用管理员密码。现有 admin 账号原密码、数据与会话均保留。</w:t>
       </w:r>
     </w:p>
     <w:p>
@@ -1330,7 +1330,7 @@
     </w:p>
     <w:p>
       <w:r>
-        <w:t>短视频若常规 30 秒采样未产生帧，会补抽首帧。抽帧、WAV 和原视频均保存在所属教师的本地目录内。即使抽帧已完成，ASR 模型缺失时也会将任务标记为失败，并显示安装模型提示。</w:t>
+        <w:t>短视频若常规 30 秒采样未产生帧，会补抽首帧。抽帧、WAV 和原视频均保存在所属教师的本地目录内。本地模式即使抽帧已完成，ASR 模型缺失时也会将任务标记为失败，并显示安装模型提示。</w:t>
       </w:r>
     </w:p>
     <w:p>
@@ -1595,7 +1595,7 @@
         <w:pStyle w:val="ListBullet"/>
       </w:pPr>
       <w:r>
-        <w:t>Markdown：便于教研记录、二次编辑和归档。</w:t>
+        <w:t>Word（.docx，默认）：工作概览打开课堂后点击“下载 Word 报告”，生成可编辑的真实 Word 文档，含画像、指标表、时间分配、优化清单、方法边界与完整转写。Pages 提供明确标注为合成内容的 Word 示例。原 format=md API 继续兼容已有调用。</w:t>
       </w:r>
     </w:p>
     <w:p>
@@ -1655,7 +1655,7 @@
     </w:p>
     <w:p>
       <w:r>
-        <w:t>去除 HTML 风格标签、零宽或 BOM 等不可见字符，合并连续空白，剔除空段。不会为“美化”转写而删去口头词，否则语言习惯统计失真。ASR 原文不由云端纠错或补写。</w:t>
+        <w:t>去除 HTML 风格标签、零宽或 BOM 等不可见字符，合并连续空白，剔除空段。不会为“美化”转写而删去口头词，否则语言习惯统计失真。本地 Whisper 原文不由云端纠错或补写；可选讯飞模式采用服务自身的动态纠错结果。</w:t>
       </w:r>
     </w:p>
     <w:p>
@@ -2853,7 +2853,7 @@
     </w:p>
     <w:p>
       <w:r>
-        <w:t>文件加密不能抵御拥有服务器和解密密钥访问权限的管理员。部署时限制数据目录的操作系统权限；完整灾备必须保护并包含主密钥。缺失主密钥时服务拒绝使用旧凭据，允许清除后重新配置。公开 Pages 只能预览配置，完全不收集 API Key，也不会连接服务。</w:t>
+        <w:t>文件加密不能抵御拥有服务器和解密密钥访问权限的管理员。部署时限制数据目录的操作系统权限；完整灾备必须保护并包含主密钥。缺失主密钥时服务拒绝使用旧凭据，允许清除后重新配置。公开 Pages 可搜索、选择预设并预览配置，完全不收集 API Key，也不会连接服务。</w:t>
       </w:r>
     </w:p>
     <w:p>
@@ -5446,12 +5446,323 @@
     </w:p>
     <w:p>
       <w:r>
-        <w:t>扩展仍遵循“学校控制模型与服务器、课堂资料不出内网、教师数据按权限隔离”的边界。</w:t>
+        <w:t>纯本地模式遵循课堂资料不出内网的边界；可选云端功能必须明确授权相应文本或音频外发，教师数据仍按权限隔离。</w:t>
       </w:r>
     </w:p>
     <w:p>
       <w:r>
         <w:t>本版本完整回归结果见 [2026-09-18 系统检验报告](系统检验报告-2026-09-18.md)。真实在线供应商尚未用学校凭据验收；本次兼容服务测试使用本机 HTTP 协议模拟服务。</w:t>
+      </w:r>
+    </w:p>
+    <w:p>
+      <w:pPr>
+        <w:pStyle w:val="Heading1"/>
+      </w:pPr>
+      <w:r>
+        <w:t>10. 1.2.0 操作更新：模型预设、超级管理员与 Word</w:t>
+      </w:r>
+    </w:p>
+    <w:p>
+      <w:pPr>
+        <w:pStyle w:val="Heading2"/>
+      </w:pPr>
+      <w:r>
+        <w:t>10.1 云端模型预设</w:t>
+      </w:r>
+    </w:p>
+    <w:p>
+      <w:r>
+        <w:t>“空间设置 → 模型提供方式 → OpenAI 兼容服务”提供可搜索的服务商列表，采用状态圆点、选中行和右侧 Key 状态的布局。内置 DeepSeek、OpenAI、通义千问（中国内地）、Moonshot/Kimi、智谱 GLM、硅基流动、OpenRouter、Fireworks AI、xAI、MiniMax 国际和中国服务共 11 个预设。</w:t>
+      </w:r>
+    </w:p>
+    <w:p>
+      <w:r>
+        <w:t>选中预设后，系统自动配置 API 地址和模型 ID，用户只需填写该服务的 Key、确认文本发送范围，再测试及保存。高级参数有默认值，可折叠调整。服务商的配额、模型权限和可用性由供应商决定，测试成功以实际账号为准。可使用“本地 / 自定义端点”或“使用此地址自定义模型”配置其他兼容模型，继续支持 HTTP 和 HTTPS。</w:t>
+      </w:r>
+    </w:p>
+    <w:p>
+      <w:r>
+        <w:t>每个账号可分别保存多个预设的加密 Key；同一时刻仅使用最后保存的提供方式。选择另一项只改变草稿，保存后才影响追问。切换项目会清空尚未保存的 Key 输入；已保存 Key 不回显。留空表示保留本预设的旧 Key，清除只影响当前预设；更改自定义端点不会转发旧地址的 Key。后端也从预设 ID 决定地址与模型，不能通过请求字段把预设 Key 重定向到其他地址。</w:t>
+      </w:r>
+    </w:p>
+    <w:p>
+      <w:r>
+        <w:t>新增 model_profiles 表保存独立配置；不迁移或删除原有课堂、用户与密码。原 model_settings 仍为生效配置，旧版没有 preset_id 的设置按自定义端点读取。所有设置与配置列表接口均要求登录；普通课堂备份不含任何模型 Key。</w:t>
+      </w:r>
+    </w:p>
+    <w:p>
+      <w:pPr>
+        <w:pStyle w:val="Heading2"/>
+      </w:pPr>
+      <w:r>
+        <w:t>10.2 管理员层级</w:t>
+      </w:r>
+    </w:p>
+    <w:p>
+      <w:r>
+        <w:t>admin 且原角色为管理员的保留账号是超级管理员。API 的 is_superadmin 字段用于界面展示；权限由服务器实际账号判断，客户端不能授予超级权限。无需重置既有密码或课堂数据。</w:t>
+      </w:r>
+    </w:p>
+    <w:p>
+      <w:r>
+        <w:t>超级管理员在“学校管理”拥有“新建教师账号”和“新建管理员账号”两个入口。普通管理员可创建教师、管理教师备份和导出自己的备份，但不能创建管理员、创建第二个超级管理员，或导出其他管理员的数据。所有角色仍只能通过普通课堂接口查看自己的课堂。admin 及大小写变体禁止通过网页创建；初始化和密码恢复由服务器 CLI 明确执行。</w:t>
+      </w:r>
+    </w:p>
+    <w:p>
+      <w:pPr>
+        <w:pStyle w:val="Heading2"/>
+      </w:pPr>
+      <w:r>
+        <w:t>10.3 默认 Word 下载</w:t>
+      </w:r>
+    </w:p>
+    <w:p>
+      <w:r>
+        <w:t>课堂详情主下载按钮改为“下载 Word 报告”，默认 GET /api/lessons/{id}/report 返回 .docx；显式 format=docx 同样可用，MIME 为标准 Office Open XML 文档类型。报告在部署服务器内生成。JSON、HTML 与旧 Markdown API 继续可用。静态 Pages 的合成 Word 文件保存在 frontend/public/example-report.docx，更新示例或模板后运行 python scripts/generate_demo_report.py 重新生成。</w:t>
+      </w:r>
+    </w:p>
+    <w:p>
+      <w:r>
+        <w:t>部署增加 python-docx==1.2.0。Docker 镜像同时包含模型预设目录文件，Pages 构建包含合成 Word 下载文件。</w:t>
+      </w:r>
+    </w:p>
+    <w:p>
+      <w:pPr>
+        <w:pStyle w:val="Heading1"/>
+      </w:pPr>
+      <w:r>
+        <w:t>11. 1.3.0 可选科大讯飞语音转写</w:t>
+      </w:r>
+    </w:p>
+    <w:p>
+      <w:pPr>
+        <w:pStyle w:val="Heading1"/>
+      </w:pPr>
+      <w:r>
+        <w:t>适用范围与数据流</w:t>
+      </w:r>
+    </w:p>
+    <w:p>
+      <w:r>
+        <w:t>默认保持本地 Whisper 转写。讯飞是可选的云端语音听写方式，与 OpenAI 兼容教研追问设置相互独立。选择讯飞后，服务器提取 16kHz、单声道、16bit PCM 音轨，通过加密 WebSocket 发往 iat-api.xfyun.cn；原视频与参考帧不发往讯飞。转写结果回存学校服务器，文本蒸馏及教学画像仍在本地计算。</w:t>
+      </w:r>
+    </w:p>
+    <w:p>
+      <w:r>
+        <w:t>讯飞会接收课堂音频，此模式不属于“全程离线”。学校应在取得相应授权后使用；如资料不得外发，请始终选择本地 Whisper 并禁用服务器的外网出口。云端请求可能消耗讯飞额度，具体计费、数据处理与留存规则以学校和服务商的约定为准。</w:t>
+      </w:r>
+    </w:p>
+    <w:p>
+      <w:pPr>
+        <w:pStyle w:val="Heading1"/>
+      </w:pPr>
+      <w:r>
+        <w:t>管理员配置</w:t>
+      </w:r>
+    </w:p>
+    <w:p>
+      <w:pPr>
+        <w:pStyle w:val="ListNumber"/>
+      </w:pPr>
+      <w:r>
+        <w:t>在讯飞控制台为应用开通语音听写（流式版）WebAPI。APPID、APIKey、APISecret 三项必须来自同一个应用。本版本并非“录音文件转写”或另一个“实时语音转写”产品的协议。</w:t>
+      </w:r>
+    </w:p>
+    <w:p>
+      <w:pPr>
+        <w:pStyle w:val="ListNumber"/>
+      </w:pPr>
+      <w:r>
+        <w:t>在服务器私有 .env 或 systemd 的 /etc/teachagent.env 设置下列变量。示例只展示变量名，不包含实际密钥。</w:t>
+      </w:r>
+    </w:p>
+    <w:p>
+      <w:pPr>
+        <w:shd w:fill="F0F5EB"/>
+      </w:pPr>
+      <w:r>
+        <w:rPr>
+          <w:rFonts w:ascii="Consolas" w:hAnsi="Consolas"/>
+          <w:sz w:val="16"/>
+        </w:rPr>
+        <w:t>IFLYTEK_APP_ID=填写应用编号</w:t>
+        <w:br/>
+        <w:t>IFLYTEK_API_KEY=填写接口密钥</w:t>
+        <w:br/>
+        <w:t>IFLYTEK_API_SECRET=填写签名密钥</w:t>
+      </w:r>
+    </w:p>
+    <w:p>
+      <w:pPr>
+        <w:pStyle w:val="ListNumber"/>
+      </w:pPr>
+      <w:r>
+        <w:t>安装更新后的依赖（新增 websockets==15.0.1），重启应用。Docker Compose 会从 .env 读取这些变量；修改后重新创建容器。</w:t>
+      </w:r>
+    </w:p>
+    <w:p>
+      <w:pPr>
+        <w:pStyle w:val="ListNumber"/>
+      </w:pPr>
+      <w:r>
+        <w:t>在“空间设置 → 本地运行状态”检查“讯飞语音听写”。“已配置”只代表三项变量完整，不代表权限、余额和网络已验证。先用获得授权的短测试录音验证。</w:t>
+      </w:r>
+    </w:p>
+    <w:p>
+      <w:pPr>
+        <w:pStyle w:val="ListNumber"/>
+      </w:pPr>
+      <w:r>
+        <w:t>保持服务器时钟准确，并允许后端访问 wss://iat-api.xfyun.cn/v2/iat（TCP 443）。浏览器不直接连接讯飞。</w:t>
+      </w:r>
+    </w:p>
+    <w:p>
+      <w:r>
+        <w:t>密钥由学校管理员管理，不在网页中显示，不放入 GitHub、Pages、Release 或教师导出备份。服务配置对该部署生效，但不会自动改变任一教师的默认转写方式。移除三项配置并重启可以停用后续云端转写。</w:t>
+      </w:r>
+    </w:p>
+    <w:p>
+      <w:pPr>
+        <w:pStyle w:val="Heading1"/>
+      </w:pPr>
+      <w:r>
+        <w:t>教师操作</w:t>
+      </w:r>
+    </w:p>
+    <w:p>
+      <w:r>
+        <w:t>![讯飞转写选择与授权](images/iflytek-upload.png)</w:t>
+      </w:r>
+    </w:p>
+    <w:p>
+      <w:pPr>
+        <w:pStyle w:val="ListNumber"/>
+      </w:pPr>
+      <w:r>
+        <w:t>登录，点击“上传新课堂”，填写课堂名称、学科及班级。</w:t>
+      </w:r>
+    </w:p>
+    <w:p>
+      <w:pPr>
+        <w:pStyle w:val="ListNumber"/>
+      </w:pPr>
+      <w:r>
+        <w:t>在“语音转写服务”选择“科大讯飞（云端语音听写）”。每次打开上传窗口，默认仍是本地 Whisper。</w:t>
+      </w:r>
+    </w:p>
+    <w:p>
+      <w:pPr>
+        <w:pStyle w:val="ListNumber"/>
+      </w:pPr>
+      <w:r>
+        <w:t>阅读音频发送、分段及费用说明，勾选“我已获得授权，同意本次及重试任务将课堂音频发送到科大讯飞”。未确认时不能提交，后端也会检查。</w:t>
+      </w:r>
+    </w:p>
+    <w:p>
+      <w:pPr>
+        <w:pStyle w:val="ListNumber"/>
+      </w:pPr>
+      <w:r>
+        <w:t>选择视频，点击“上传并开始分析”。讯飞任务显示“讯飞云端转写：正在发送音频”；完成后照常查看画像、证据、建议及报告。</w:t>
+      </w:r>
+    </w:p>
+    <w:p>
+      <w:pPr>
+        <w:pStyle w:val="ListNumber"/>
+      </w:pPr>
+      <w:r>
+        <w:t>课堂详情保留讯飞来源标记，转写片段标注“音频块时间范围，非逐句对齐”。Word / HTML / JSON 报告保留分析中的方法边界。</w:t>
+      </w:r>
+    </w:p>
+    <w:p>
+      <w:r>
+        <w:t>选择会绑定到该课堂。失败重试继续使用原转写服务及原授权，可能再次产生费用；不会静默切换到本地或云端。若希望换回本地，请重新上传并选本地 Whisper。教师只能操作自己的课堂。授权事件记录在审计日志中。</w:t>
+      </w:r>
+    </w:p>
+    <w:p>
+      <w:pPr>
+        <w:pStyle w:val="Heading1"/>
+      </w:pPr>
+      <w:r>
+        <w:t>长课堂与识别精度</w:t>
+      </w:r>
+    </w:p>
+    <w:p>
+      <w:r>
+        <w:t>官方流式听写单次支持 60 秒以内音频，静音后端点最大 10 秒。本版本采用连续 8 秒音频块，每个块独立建立会话，并按 40ms / 1280 字节发送；全片顺序处理，不截取前一分钟。开启 dwa=wpgs，合并服务端的动态替换结果。</w:t>
+      </w:r>
+    </w:p>
+    <w:p>
+      <w:r>
+        <w:t>此方案避免长静音导致一个会话提前结束，但固定切分可能截断词句上下文。时间戳表示音频块覆盖范围，不是逐句或逐词对齐；环节时长、片段数量、语速等会受分段影响，应结合录音复核。不进行声纹分离，不保证比所有本地模型更准确。</w:t>
+      </w:r>
+    </w:p>
+    <w:p>
+      <w:r>
+        <w:t>发送速度接近实时，加上握手与结果等待，处理耗时通常不少于音频时长。长课会产生多个计费请求；并发仍为单任务队列。连接错误会明确失败，修复后手动重试，全片重新处理，不支持断点续传。</w:t>
+      </w:r>
+    </w:p>
+    <w:p>
+      <w:r>
+        <w:t>如需要更准确的纯本地方案，可由管理员将 tiny 模型升级为 small、medium 或适合硬件的更大模型，改善拾音、降低噪声，并用本校样本对比。更大模型需更多内存、算力和时间。可先校对文本，再通过文本导入重新分析。</w:t>
+      </w:r>
+    </w:p>
+    <w:p>
+      <w:pPr>
+        <w:pStyle w:val="Heading1"/>
+      </w:pPr>
+      <w:r>
+        <w:t>排错与验证边界</w:t>
+      </w:r>
+    </w:p>
+    <w:p>
+      <w:pPr>
+        <w:pStyle w:val="ListBullet"/>
+      </w:pPr>
+      <w:r>
+        <w:t>尚未配置：检查三项环境变量，重启实际运行的服务；不要把语音认证信息填入 OpenAI 对话设置。</w:t>
+      </w:r>
+    </w:p>
+    <w:p>
+      <w:pPr>
+        <w:pStyle w:val="ListBullet"/>
+      </w:pPr>
+      <w:r>
+        <w:t>鉴权或连接错误：核对同一应用的三项信息、语音听写权限、外网及系统时间。</w:t>
+      </w:r>
+    </w:p>
+    <w:p>
+      <w:pPr>
+        <w:pStyle w:val="ListBullet"/>
+      </w:pPr>
+      <w:r>
+        <w:t>服务端返回错误码：在讯飞控制台检查服务开通、余额和限流；界面只显示错误码，不泄露签名 URL 或服务原始错误内容。</w:t>
+      </w:r>
+    </w:p>
+    <w:p>
+      <w:pPr>
+        <w:pStyle w:val="ListBullet"/>
+      </w:pPr>
+      <w:r>
+        <w:t>结果为空：检查音轨是否为有效普通话语音、音量及录音质量。</w:t>
+      </w:r>
+    </w:p>
+    <w:p>
+      <w:pPr>
+        <w:pStyle w:val="ListBullet"/>
+      </w:pPr>
+      <w:r>
+        <w:t>GitHub Pages：仅显示新功能说明，不接收音频、账号密码或讯飞密钥，也不发起讯飞请求。</w:t>
+      </w:r>
+    </w:p>
+    <w:p>
+      <w:r>
+        <w:t>2026-09-28 已用 Windows 合成普通话“同学们，今天我们学习三角形。请大家思考，三角形的内角和是多少度？”验证真实 WebSocket 认证、传音与返回识别文本。该验证未使用学校音频，也不是课堂识别率基准测试。真实教室噪声、多人讲话、长课的识别质量仍需学校用获授权的样本验收。</w:t>
+      </w:r>
+    </w:p>
+    <w:p>
+      <w:r>
+        <w:t>协议依据：[讯飞语音听写 WebAPI 官方文档](https://www.xfyun.cn/doc/asr/voicedictation/API.html)。</w:t>
       </w:r>
     </w:p>
     <w:sectPr>
@@ -5473,7 +5784,7 @@
       <w:pStyle w:val="Footer"/>
     </w:pPr>
     <w:r>
-      <w:t xml:space="preserve">TeachAgent 1.1.0    ·    功能与部署文档                                      </w:t>
+      <w:t xml:space="preserve">TeachAgent 1.3.0    ·    功能与部署文档                                      </w:t>
     </w:r>
     <w:fldSimple w:instr="PAGE"/>
   </w:p>

</xml_diff>